<commit_message>
atualização da aula 28/09/26
</commit_message>
<xml_diff>
--- a/apostila/Projeto Space for me3.docx
+++ b/apostila/Projeto Space for me3.docx
@@ -11933,6 +11933,9 @@
     </w:p>
     <w:p>
       <w:r>
+        <w:rPr>
+          <w:noProof/>
+        </w:rPr>
         <w:drawing>
           <wp:inline distT="0" distB="0" distL="0" distR="0" wp14:anchorId="31651629" wp14:editId="0E0FE92E">
             <wp:extent cx="1895740" cy="1400370"/>
@@ -12131,6 +12134,7 @@
       <w:r>
         <w:rPr>
           <w:i/>
+          <w:noProof/>
         </w:rPr>
         <w:drawing>
           <wp:inline distT="0" distB="0" distL="0" distR="0" wp14:anchorId="3FCC94A0" wp14:editId="266E975E">
@@ -12171,6 +12175,7 @@
       <w:r>
         <w:rPr>
           <w:i/>
+          <w:noProof/>
         </w:rPr>
         <w:drawing>
           <wp:inline distT="0" distB="0" distL="0" distR="0" wp14:anchorId="33CFAAA8" wp14:editId="768FB825">
@@ -12348,6 +12353,7 @@
       <w:r>
         <w:rPr>
           <w:i/>
+          <w:noProof/>
         </w:rPr>
         <w:drawing>
           <wp:inline distT="0" distB="0" distL="0" distR="0" wp14:anchorId="184BF172" wp14:editId="347A6480">
@@ -12442,6 +12448,7 @@
       <w:r>
         <w:rPr>
           <w:i/>
+          <w:noProof/>
         </w:rPr>
         <w:drawing>
           <wp:inline distT="0" distB="0" distL="0" distR="0" wp14:anchorId="65B71093" wp14:editId="3B03B331">
@@ -12575,6 +12582,7 @@
       <w:r>
         <w:rPr>
           <w:i/>
+          <w:noProof/>
         </w:rPr>
         <w:drawing>
           <wp:inline distT="0" distB="0" distL="0" distR="0" wp14:anchorId="729698EE" wp14:editId="1675CDFC">
@@ -12615,6 +12623,7 @@
       <w:r>
         <w:rPr>
           <w:i/>
+          <w:noProof/>
         </w:rPr>
         <w:drawing>
           <wp:inline distT="0" distB="0" distL="0" distR="0" wp14:anchorId="6F756DE0" wp14:editId="021B723C">
@@ -12681,6 +12690,7 @@
       <w:r>
         <w:rPr>
           <w:i/>
+          <w:noProof/>
         </w:rPr>
         <w:drawing>
           <wp:inline distT="0" distB="0" distL="0" distR="0" wp14:anchorId="0B734B46" wp14:editId="611B83C2">
@@ -12755,6 +12765,7 @@
       <w:r>
         <w:rPr>
           <w:i/>
+          <w:noProof/>
         </w:rPr>
         <w:drawing>
           <wp:inline distT="0" distB="0" distL="0" distR="0" wp14:anchorId="35D713B5" wp14:editId="171BD821">
@@ -12795,6 +12806,7 @@
       <w:r>
         <w:rPr>
           <w:i/>
+          <w:noProof/>
         </w:rPr>
         <w:drawing>
           <wp:inline distT="0" distB="0" distL="0" distR="0" wp14:anchorId="1E63BE22" wp14:editId="7381EC6D">
@@ -12832,8 +12844,728 @@
           </wp:inline>
         </w:drawing>
       </w:r>
+    </w:p>
+    <w:p>
+      <w:pPr>
+        <w:rPr>
+          <w:i/>
+        </w:rPr>
+      </w:pPr>
+      <w:r>
+        <w:rPr>
+          <w:i/>
+          <w:noProof/>
+        </w:rPr>
+        <mc:AlternateContent>
+          <mc:Choice Requires="wps">
+            <w:drawing>
+              <wp:anchor distT="0" distB="0" distL="114300" distR="114300" simplePos="0" relativeHeight="251704320" behindDoc="0" locked="0" layoutInCell="1" allowOverlap="1" wp14:anchorId="4EEB0765" wp14:editId="34955C21">
+                <wp:simplePos x="0" y="0"/>
+                <wp:positionH relativeFrom="column">
+                  <wp:posOffset>1257300</wp:posOffset>
+                </wp:positionH>
+                <wp:positionV relativeFrom="paragraph">
+                  <wp:posOffset>450215</wp:posOffset>
+                </wp:positionV>
+                <wp:extent cx="781050" cy="495300"/>
+                <wp:effectExtent l="38100" t="0" r="19050" b="57150"/>
+                <wp:wrapNone/>
+                <wp:docPr id="189" name="Conector de Seta Reta 189"/>
+                <wp:cNvGraphicFramePr/>
+                <a:graphic xmlns:a="http://schemas.openxmlformats.org/drawingml/2006/main">
+                  <a:graphicData uri="http://schemas.microsoft.com/office/word/2010/wordprocessingShape">
+                    <wps:wsp>
+                      <wps:cNvCnPr/>
+                      <wps:spPr>
+                        <a:xfrm flipH="1">
+                          <a:off x="0" y="0"/>
+                          <a:ext cx="781050" cy="495300"/>
+                        </a:xfrm>
+                        <a:prstGeom prst="straightConnector1">
+                          <a:avLst/>
+                        </a:prstGeom>
+                        <a:ln>
+                          <a:tailEnd type="triangle"/>
+                        </a:ln>
+                      </wps:spPr>
+                      <wps:style>
+                        <a:lnRef idx="1">
+                          <a:schemeClr val="accent1"/>
+                        </a:lnRef>
+                        <a:fillRef idx="0">
+                          <a:schemeClr val="accent1"/>
+                        </a:fillRef>
+                        <a:effectRef idx="0">
+                          <a:schemeClr val="accent1"/>
+                        </a:effectRef>
+                        <a:fontRef idx="minor">
+                          <a:schemeClr val="tx1"/>
+                        </a:fontRef>
+                      </wps:style>
+                      <wps:bodyPr/>
+                    </wps:wsp>
+                  </a:graphicData>
+                </a:graphic>
+              </wp:anchor>
+            </w:drawing>
+          </mc:Choice>
+          <mc:Fallback>
+            <w:pict>
+              <v:shapetype w14:anchorId="3EE9DED9" id="_x0000_t32" coordsize="21600,21600" o:spt="32" o:oned="t" path="m,l21600,21600e" filled="f">
+                <v:path arrowok="t" fillok="f" o:connecttype="none"/>
+                <o:lock v:ext="edit" shapetype="t"/>
+              </v:shapetype>
+              <v:shape id="Conector de Seta Reta 189" o:spid="_x0000_s1026" type="#_x0000_t32" style="position:absolute;margin-left:99pt;margin-top:35.45pt;width:61.5pt;height:39pt;flip:x;z-index:251704320;visibility:visible;mso-wrap-style:square;mso-wrap-distance-left:9pt;mso-wrap-distance-top:0;mso-wrap-distance-right:9pt;mso-wrap-distance-bottom:0;mso-position-horizontal:absolute;mso-position-horizontal-relative:text;mso-position-vertical:absolute;mso-position-vertical-relative:text" o:gfxdata="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" strokecolor="#4472c4 [3204]" strokeweight=".5pt">
+                <v:stroke endarrow="block" joinstyle="miter"/>
+              </v:shape>
+            </w:pict>
+          </mc:Fallback>
+        </mc:AlternateContent>
+      </w:r>
+      <w:r>
+        <w:rPr>
+          <w:i/>
+        </w:rPr>
+        <w:t xml:space="preserve">91-Para colocar o texto ao lado da imagem utilizamos uma técnica de flutuação chamada </w:t>
+      </w:r>
+      <w:proofErr w:type="spellStart"/>
+      <w:r>
+        <w:rPr>
+          <w:i/>
+        </w:rPr>
+        <w:t>float</w:t>
+      </w:r>
+      <w:proofErr w:type="spellEnd"/>
+      <w:r>
+        <w:rPr>
+          <w:i/>
+        </w:rPr>
+        <w:t xml:space="preserve">, quando utilizamos esse recurso, o elemento descola da página o que </w:t>
+      </w:r>
+      <w:proofErr w:type="spellStart"/>
+      <w:proofErr w:type="gramStart"/>
+      <w:r>
+        <w:rPr>
+          <w:i/>
+        </w:rPr>
+        <w:t>esta</w:t>
+      </w:r>
+      <w:proofErr w:type="spellEnd"/>
+      <w:proofErr w:type="gramEnd"/>
+      <w:r>
+        <w:rPr>
+          <w:i/>
+        </w:rPr>
+        <w:t xml:space="preserve"> em baixo para cima, se atentando a sua sombra, continua ocupando virtualmente o espaço.</w:t>
+      </w:r>
+    </w:p>
+    <w:p>
+      <w:pPr>
+        <w:rPr>
+          <w:i/>
+        </w:rPr>
+      </w:pPr>
+      <w:r>
+        <w:rPr>
+          <w:i/>
+        </w:rPr>
+        <w:drawing>
+          <wp:inline distT="0" distB="0" distL="0" distR="0" wp14:anchorId="6487C89C" wp14:editId="4827F1CC">
+            <wp:extent cx="1571844" cy="752580"/>
+            <wp:effectExtent l="0" t="0" r="9525" b="9525"/>
+            <wp:docPr id="187" name="Imagem 187"/>
+            <wp:cNvGraphicFramePr>
+              <a:graphicFrameLocks xmlns:a="http://schemas.openxmlformats.org/drawingml/2006/main" noChangeAspect="1"/>
+            </wp:cNvGraphicFramePr>
+            <a:graphic xmlns:a="http://schemas.openxmlformats.org/drawingml/2006/main">
+              <a:graphicData uri="http://schemas.openxmlformats.org/drawingml/2006/picture">
+                <pic:pic xmlns:pic="http://schemas.openxmlformats.org/drawingml/2006/picture">
+                  <pic:nvPicPr>
+                    <pic:cNvPr id="1" name=""/>
+                    <pic:cNvPicPr/>
+                  </pic:nvPicPr>
+                  <pic:blipFill>
+                    <a:blip r:embed="rId153"/>
+                    <a:stretch>
+                      <a:fillRect/>
+                    </a:stretch>
+                  </pic:blipFill>
+                  <pic:spPr>
+                    <a:xfrm>
+                      <a:off x="0" y="0"/>
+                      <a:ext cx="1571844" cy="752580"/>
+                    </a:xfrm>
+                    <a:prstGeom prst="rect">
+                      <a:avLst/>
+                    </a:prstGeom>
+                  </pic:spPr>
+                </pic:pic>
+              </a:graphicData>
+            </a:graphic>
+          </wp:inline>
+        </w:drawing>
+      </w:r>
+    </w:p>
+    <w:p>
+      <w:pPr>
+        <w:rPr>
+          <w:i/>
+        </w:rPr>
+      </w:pPr>
+      <w:r>
+        <w:rPr>
+          <w:i/>
+        </w:rPr>
+        <w:t xml:space="preserve">92-observamos que ao utilizar o </w:t>
+      </w:r>
+      <w:proofErr w:type="spellStart"/>
+      <w:r>
+        <w:rPr>
+          <w:i/>
+        </w:rPr>
+        <w:t>float</w:t>
+      </w:r>
+      <w:proofErr w:type="spellEnd"/>
+      <w:r>
+        <w:rPr>
+          <w:i/>
+        </w:rPr>
+        <w:t xml:space="preserve"> o elemento </w:t>
+      </w:r>
+      <w:r>
+        <w:rPr>
+          <w:i/>
+        </w:rPr>
+        <w:t xml:space="preserve">a baixo subiu para voltar anterior utilizamos o </w:t>
+      </w:r>
+      <w:proofErr w:type="spellStart"/>
+      <w:proofErr w:type="gramStart"/>
+      <w:r>
+        <w:rPr>
+          <w:i/>
+        </w:rPr>
+        <w:t>clear</w:t>
+      </w:r>
+      <w:proofErr w:type="spellEnd"/>
+      <w:r>
+        <w:rPr>
+          <w:i/>
+        </w:rPr>
+        <w:t xml:space="preserve"> :</w:t>
+      </w:r>
+      <w:proofErr w:type="gramEnd"/>
+      <w:r>
+        <w:rPr>
+          <w:i/>
+        </w:rPr>
+        <w:t xml:space="preserve"> </w:t>
+      </w:r>
+      <w:proofErr w:type="spellStart"/>
+      <w:r>
+        <w:rPr>
+          <w:i/>
+        </w:rPr>
+        <w:t>left</w:t>
+      </w:r>
+      <w:proofErr w:type="spellEnd"/>
+      <w:r>
+        <w:rPr>
+          <w:i/>
+        </w:rPr>
+        <w:t xml:space="preserve"> </w:t>
+      </w:r>
+    </w:p>
+    <w:p>
+      <w:pPr>
+        <w:rPr>
+          <w:i/>
+        </w:rPr>
+      </w:pPr>
+      <w:r>
+        <w:rPr>
+          <w:i/>
+          <w:noProof/>
+        </w:rPr>
+        <mc:AlternateContent>
+          <mc:Choice Requires="wps">
+            <w:drawing>
+              <wp:anchor distT="0" distB="0" distL="114300" distR="114300" simplePos="0" relativeHeight="251705344" behindDoc="0" locked="0" layoutInCell="1" allowOverlap="1" wp14:anchorId="7F2FFD93" wp14:editId="21D830D3">
+                <wp:simplePos x="0" y="0"/>
+                <wp:positionH relativeFrom="column">
+                  <wp:posOffset>1028700</wp:posOffset>
+                </wp:positionH>
+                <wp:positionV relativeFrom="paragraph">
+                  <wp:posOffset>72390</wp:posOffset>
+                </wp:positionV>
+                <wp:extent cx="1695450" cy="704850"/>
+                <wp:effectExtent l="38100" t="0" r="19050" b="57150"/>
+                <wp:wrapNone/>
+                <wp:docPr id="190" name="Conector de Seta Reta 190"/>
+                <wp:cNvGraphicFramePr/>
+                <a:graphic xmlns:a="http://schemas.openxmlformats.org/drawingml/2006/main">
+                  <a:graphicData uri="http://schemas.microsoft.com/office/word/2010/wordprocessingShape">
+                    <wps:wsp>
+                      <wps:cNvCnPr/>
+                      <wps:spPr>
+                        <a:xfrm flipH="1">
+                          <a:off x="0" y="0"/>
+                          <a:ext cx="1695450" cy="704850"/>
+                        </a:xfrm>
+                        <a:prstGeom prst="straightConnector1">
+                          <a:avLst/>
+                        </a:prstGeom>
+                        <a:ln>
+                          <a:tailEnd type="triangle"/>
+                        </a:ln>
+                      </wps:spPr>
+                      <wps:style>
+                        <a:lnRef idx="1">
+                          <a:schemeClr val="accent1"/>
+                        </a:lnRef>
+                        <a:fillRef idx="0">
+                          <a:schemeClr val="accent1"/>
+                        </a:fillRef>
+                        <a:effectRef idx="0">
+                          <a:schemeClr val="accent1"/>
+                        </a:effectRef>
+                        <a:fontRef idx="minor">
+                          <a:schemeClr val="tx1"/>
+                        </a:fontRef>
+                      </wps:style>
+                      <wps:bodyPr/>
+                    </wps:wsp>
+                  </a:graphicData>
+                </a:graphic>
+              </wp:anchor>
+            </w:drawing>
+          </mc:Choice>
+          <mc:Fallback>
+            <w:pict>
+              <v:shape w14:anchorId="0A32E143" id="Conector de Seta Reta 190" o:spid="_x0000_s1026" type="#_x0000_t32" style="position:absolute;margin-left:81pt;margin-top:5.7pt;width:133.5pt;height:55.5pt;flip:x;z-index:251705344;visibility:visible;mso-wrap-style:square;mso-wrap-distance-left:9pt;mso-wrap-distance-top:0;mso-wrap-distance-right:9pt;mso-wrap-distance-bottom:0;mso-position-horizontal:absolute;mso-position-horizontal-relative:text;mso-position-vertical:absolute;mso-position-vertical-relative:text" o:gfxdata="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" strokecolor="#4472c4 [3204]" strokeweight=".5pt">
+                <v:stroke endarrow="block" joinstyle="miter"/>
+              </v:shape>
+            </w:pict>
+          </mc:Fallback>
+        </mc:AlternateContent>
+      </w:r>
+      <w:r>
+        <w:rPr>
+          <w:i/>
+        </w:rPr>
+        <w:drawing>
+          <wp:inline distT="0" distB="0" distL="0" distR="0" wp14:anchorId="51CA5280" wp14:editId="59CBE119">
+            <wp:extent cx="1924319" cy="1105054"/>
+            <wp:effectExtent l="0" t="0" r="0" b="0"/>
+            <wp:docPr id="188" name="Imagem 188"/>
+            <wp:cNvGraphicFramePr>
+              <a:graphicFrameLocks xmlns:a="http://schemas.openxmlformats.org/drawingml/2006/main" noChangeAspect="1"/>
+            </wp:cNvGraphicFramePr>
+            <a:graphic xmlns:a="http://schemas.openxmlformats.org/drawingml/2006/main">
+              <a:graphicData uri="http://schemas.openxmlformats.org/drawingml/2006/picture">
+                <pic:pic xmlns:pic="http://schemas.openxmlformats.org/drawingml/2006/picture">
+                  <pic:nvPicPr>
+                    <pic:cNvPr id="1" name=""/>
+                    <pic:cNvPicPr/>
+                  </pic:nvPicPr>
+                  <pic:blipFill>
+                    <a:blip r:embed="rId154"/>
+                    <a:stretch>
+                      <a:fillRect/>
+                    </a:stretch>
+                  </pic:blipFill>
+                  <pic:spPr>
+                    <a:xfrm>
+                      <a:off x="0" y="0"/>
+                      <a:ext cx="1924319" cy="1105054"/>
+                    </a:xfrm>
+                    <a:prstGeom prst="rect">
+                      <a:avLst/>
+                    </a:prstGeom>
+                  </pic:spPr>
+                </pic:pic>
+              </a:graphicData>
+            </a:graphic>
+          </wp:inline>
+        </w:drawing>
+      </w:r>
+    </w:p>
+    <w:p>
+      <w:pPr>
+        <w:rPr>
+          <w:i/>
+        </w:rPr>
+      </w:pPr>
+      <w:r>
+        <w:rPr>
+          <w:i/>
+        </w:rPr>
+        <w:t>93-O texto estava muito colado com a imagem, inserimos uma distância externa de 20px para direita e 20px para baixo.</w:t>
+      </w:r>
+    </w:p>
+    <w:p>
+      <w:pPr>
+        <w:rPr>
+          <w:i/>
+        </w:rPr>
+      </w:pPr>
+      <w:r>
+        <w:rPr>
+          <w:i/>
+        </w:rPr>
+        <w:drawing>
+          <wp:inline distT="0" distB="0" distL="0" distR="0" wp14:anchorId="40361564" wp14:editId="75DF7E6F">
+            <wp:extent cx="2124371" cy="1095528"/>
+            <wp:effectExtent l="0" t="0" r="0" b="9525"/>
+            <wp:docPr id="191" name="Imagem 191"/>
+            <wp:cNvGraphicFramePr>
+              <a:graphicFrameLocks xmlns:a="http://schemas.openxmlformats.org/drawingml/2006/main" noChangeAspect="1"/>
+            </wp:cNvGraphicFramePr>
+            <a:graphic xmlns:a="http://schemas.openxmlformats.org/drawingml/2006/main">
+              <a:graphicData uri="http://schemas.openxmlformats.org/drawingml/2006/picture">
+                <pic:pic xmlns:pic="http://schemas.openxmlformats.org/drawingml/2006/picture">
+                  <pic:nvPicPr>
+                    <pic:cNvPr id="1" name=""/>
+                    <pic:cNvPicPr/>
+                  </pic:nvPicPr>
+                  <pic:blipFill>
+                    <a:blip r:embed="rId155"/>
+                    <a:stretch>
+                      <a:fillRect/>
+                    </a:stretch>
+                  </pic:blipFill>
+                  <pic:spPr>
+                    <a:xfrm>
+                      <a:off x="0" y="0"/>
+                      <a:ext cx="2124371" cy="1095528"/>
+                    </a:xfrm>
+                    <a:prstGeom prst="rect">
+                      <a:avLst/>
+                    </a:prstGeom>
+                  </pic:spPr>
+                </pic:pic>
+              </a:graphicData>
+            </a:graphic>
+          </wp:inline>
+        </w:drawing>
+      </w:r>
+      <w:r>
+        <w:rPr>
+          <w:i/>
+        </w:rPr>
+        <w:drawing>
+          <wp:inline distT="0" distB="0" distL="0" distR="0" wp14:anchorId="67892BE1" wp14:editId="636B0E79">
+            <wp:extent cx="8543923" cy="1104900"/>
+            <wp:effectExtent l="0" t="0" r="0" b="0"/>
+            <wp:docPr id="192" name="Imagem 192"/>
+            <wp:cNvGraphicFramePr>
+              <a:graphicFrameLocks xmlns:a="http://schemas.openxmlformats.org/drawingml/2006/main" noChangeAspect="1"/>
+            </wp:cNvGraphicFramePr>
+            <a:graphic xmlns:a="http://schemas.openxmlformats.org/drawingml/2006/main">
+              <a:graphicData uri="http://schemas.openxmlformats.org/drawingml/2006/picture">
+                <pic:pic xmlns:pic="http://schemas.openxmlformats.org/drawingml/2006/picture">
+                  <pic:nvPicPr>
+                    <pic:cNvPr id="1" name=""/>
+                    <pic:cNvPicPr/>
+                  </pic:nvPicPr>
+                  <pic:blipFill>
+                    <a:blip r:embed="rId156"/>
+                    <a:stretch>
+                      <a:fillRect/>
+                    </a:stretch>
+                  </pic:blipFill>
+                  <pic:spPr>
+                    <a:xfrm>
+                      <a:off x="0" y="0"/>
+                      <a:ext cx="8563496" cy="1107431"/>
+                    </a:xfrm>
+                    <a:prstGeom prst="rect">
+                      <a:avLst/>
+                    </a:prstGeom>
+                  </pic:spPr>
+                </pic:pic>
+              </a:graphicData>
+            </a:graphic>
+          </wp:inline>
+        </w:drawing>
+      </w:r>
+    </w:p>
+    <w:p>
+      <w:pPr>
+        <w:rPr>
+          <w:i/>
+        </w:rPr>
+      </w:pPr>
+      <w:r>
+        <w:rPr>
+          <w:i/>
+        </w:rPr>
+        <w:t>94-</w:t>
+      </w:r>
+      <w:r>
+        <w:rPr>
+          <w:i/>
+        </w:rPr>
+        <w:t>Trabalhando com fontes da internet vamos escolher uma fonte para nosso site que seja preparado pela internet.</w:t>
+      </w:r>
+    </w:p>
+    <w:p>
+      <w:pPr>
+        <w:rPr>
+          <w:i/>
+        </w:rPr>
+      </w:pPr>
+      <w:r>
+        <w:rPr>
+          <w:i/>
+        </w:rPr>
+        <w:t>Qual a diferença ser preparada ou não para internet é que a fonte independente do navegador vai se comporta da mesma forma.</w:t>
+      </w:r>
+    </w:p>
+    <w:p>
+      <w:pPr>
+        <w:rPr>
+          <w:i/>
+        </w:rPr>
+      </w:pPr>
+      <w:r>
+        <w:rPr>
+          <w:i/>
+        </w:rPr>
+        <w:t xml:space="preserve">Entra no </w:t>
+      </w:r>
+      <w:proofErr w:type="gramStart"/>
+      <w:r>
+        <w:rPr>
+          <w:i/>
+        </w:rPr>
+        <w:t>site :</w:t>
+      </w:r>
+      <w:proofErr w:type="gramEnd"/>
+      <w:r>
+        <w:rPr>
+          <w:i/>
+        </w:rPr>
+        <w:t xml:space="preserve"> </w:t>
+      </w:r>
+      <w:hyperlink r:id="rId157" w:history="1">
+        <w:r>
+          <w:rPr>
+            <w:rStyle w:val="Hyperlink"/>
+            <w:i/>
+          </w:rPr>
+          <w:t>https://fonts.google.com</w:t>
+        </w:r>
+      </w:hyperlink>
+      <w:r>
+        <w:rPr>
+          <w:i/>
+        </w:rPr>
+        <w:t xml:space="preserve"> para escolher a fonte que desejamos e copia o código que é gerado para colar no </w:t>
+      </w:r>
+      <w:proofErr w:type="spellStart"/>
+      <w:r>
+        <w:rPr>
+          <w:i/>
+        </w:rPr>
+        <w:t>html</w:t>
+      </w:r>
+      <w:proofErr w:type="spellEnd"/>
+      <w:r>
+        <w:rPr>
+          <w:i/>
+        </w:rPr>
+        <w:t xml:space="preserve"> e no </w:t>
+      </w:r>
+      <w:proofErr w:type="spellStart"/>
+      <w:r>
+        <w:rPr>
+          <w:i/>
+        </w:rPr>
+        <w:t>css</w:t>
+      </w:r>
+      <w:proofErr w:type="spellEnd"/>
+      <w:r>
+        <w:rPr>
+          <w:i/>
+        </w:rPr>
+        <w:t>.</w:t>
+      </w:r>
+    </w:p>
+    <w:p>
+      <w:pPr>
+        <w:rPr>
+          <w:i/>
+        </w:rPr>
+      </w:pPr>
+      <w:r>
+        <w:rPr>
+          <w:i/>
+        </w:rPr>
+        <w:t>L</w:t>
+      </w:r>
+      <w:r>
+        <w:rPr>
+          <w:i/>
+        </w:rPr>
+        <w:t xml:space="preserve">embrando que precisamos colar dentro do </w:t>
+      </w:r>
+      <w:proofErr w:type="spellStart"/>
+      <w:r>
+        <w:rPr>
+          <w:i/>
+        </w:rPr>
+        <w:t>head</w:t>
+      </w:r>
+      <w:proofErr w:type="spellEnd"/>
+      <w:r>
+        <w:rPr>
+          <w:i/>
+        </w:rPr>
+        <w:t xml:space="preserve"> e no </w:t>
+      </w:r>
+      <w:proofErr w:type="spellStart"/>
+      <w:r>
+        <w:rPr>
+          <w:i/>
+        </w:rPr>
+        <w:t>css</w:t>
+      </w:r>
+      <w:proofErr w:type="spellEnd"/>
+      <w:r>
+        <w:rPr>
+          <w:i/>
+        </w:rPr>
+        <w:t xml:space="preserve"> colocamos aonde queremos aplicar a fonte.</w:t>
+      </w:r>
+    </w:p>
+    <w:p>
+      <w:pPr>
+        <w:rPr>
+          <w:i/>
+          <w:vertAlign w:val="subscript"/>
+        </w:rPr>
+      </w:pPr>
+      <w:r>
+        <w:rPr>
+          <w:i/>
+        </w:rPr>
+        <w:drawing>
+          <wp:inline distT="0" distB="0" distL="0" distR="0" wp14:anchorId="1BE8E932" wp14:editId="0EC18DC5">
+            <wp:extent cx="8734425" cy="3619500"/>
+            <wp:effectExtent l="0" t="0" r="9525" b="0"/>
+            <wp:docPr id="193" name="Imagem 193"/>
+            <wp:cNvGraphicFramePr>
+              <a:graphicFrameLocks xmlns:a="http://schemas.openxmlformats.org/drawingml/2006/main" noChangeAspect="1"/>
+            </wp:cNvGraphicFramePr>
+            <a:graphic xmlns:a="http://schemas.openxmlformats.org/drawingml/2006/main">
+              <a:graphicData uri="http://schemas.openxmlformats.org/drawingml/2006/picture">
+                <pic:pic xmlns:pic="http://schemas.openxmlformats.org/drawingml/2006/picture">
+                  <pic:nvPicPr>
+                    <pic:cNvPr id="1" name=""/>
+                    <pic:cNvPicPr/>
+                  </pic:nvPicPr>
+                  <pic:blipFill>
+                    <a:blip r:embed="rId158"/>
+                    <a:stretch>
+                      <a:fillRect/>
+                    </a:stretch>
+                  </pic:blipFill>
+                  <pic:spPr>
+                    <a:xfrm>
+                      <a:off x="0" y="0"/>
+                      <a:ext cx="8734688" cy="3619609"/>
+                    </a:xfrm>
+                    <a:prstGeom prst="rect">
+                      <a:avLst/>
+                    </a:prstGeom>
+                  </pic:spPr>
+                </pic:pic>
+              </a:graphicData>
+            </a:graphic>
+          </wp:inline>
+        </w:drawing>
+      </w:r>
+    </w:p>
+    <w:p>
+      <w:r>
+        <w:t>95-</w:t>
+      </w:r>
+      <w:r>
+        <w:t xml:space="preserve">Para inserir um mapa no site acessamos o </w:t>
+      </w:r>
+      <w:proofErr w:type="spellStart"/>
+      <w:r>
+        <w:t>google</w:t>
+      </w:r>
+      <w:proofErr w:type="spellEnd"/>
+      <w:r>
+        <w:t xml:space="preserve"> </w:t>
+      </w:r>
+      <w:proofErr w:type="spellStart"/>
+      <w:r>
+        <w:t>maps</w:t>
+      </w:r>
+      <w:proofErr w:type="spellEnd"/>
+      <w:r>
+        <w:t xml:space="preserve"> digitando o estabelecimento desejado no nosso caso Barbearia Space For </w:t>
+      </w:r>
+      <w:proofErr w:type="spellStart"/>
+      <w:r>
+        <w:t>men</w:t>
+      </w:r>
+      <w:proofErr w:type="spellEnd"/>
+      <w:r>
+        <w:t xml:space="preserve">. No campo parecido 3 pontinhos ou três linhas vai aparecer a seguinte tela com o campo compartilhado ou incorporar acessamos esse campo e copiamos o link que gera para colocar no </w:t>
+      </w:r>
+      <w:proofErr w:type="spellStart"/>
+      <w:r>
+        <w:t>html</w:t>
+      </w:r>
+      <w:proofErr w:type="spellEnd"/>
+      <w:r>
+        <w:t>.</w:t>
+      </w:r>
       <w:bookmarkStart w:id="0" w:name="_GoBack"/>
       <w:bookmarkEnd w:id="0"/>
+    </w:p>
+    <w:p>
+      <w:r>
+        <w:drawing>
+          <wp:inline distT="0" distB="0" distL="0" distR="0" wp14:anchorId="385DEAB4" wp14:editId="0601C426">
+            <wp:extent cx="7163800" cy="4858428"/>
+            <wp:effectExtent l="0" t="0" r="0" b="0"/>
+            <wp:docPr id="194" name="Imagem 194"/>
+            <wp:cNvGraphicFramePr>
+              <a:graphicFrameLocks xmlns:a="http://schemas.openxmlformats.org/drawingml/2006/main" noChangeAspect="1"/>
+            </wp:cNvGraphicFramePr>
+            <a:graphic xmlns:a="http://schemas.openxmlformats.org/drawingml/2006/main">
+              <a:graphicData uri="http://schemas.openxmlformats.org/drawingml/2006/picture">
+                <pic:pic xmlns:pic="http://schemas.openxmlformats.org/drawingml/2006/picture">
+                  <pic:nvPicPr>
+                    <pic:cNvPr id="1" name=""/>
+                    <pic:cNvPicPr/>
+                  </pic:nvPicPr>
+                  <pic:blipFill>
+                    <a:blip r:embed="rId159"/>
+                    <a:stretch>
+                      <a:fillRect/>
+                    </a:stretch>
+                  </pic:blipFill>
+                  <pic:spPr>
+                    <a:xfrm>
+                      <a:off x="0" y="0"/>
+                      <a:ext cx="7163800" cy="4858428"/>
+                    </a:xfrm>
+                    <a:prstGeom prst="rect">
+                      <a:avLst/>
+                    </a:prstGeom>
+                  </pic:spPr>
+                </pic:pic>
+              </a:graphicData>
+            </a:graphic>
+          </wp:inline>
+        </w:drawing>
+      </w:r>
     </w:p>
     <w:p>
       <w:pPr>
@@ -13664,6 +14396,15 @@
       <w:shd w:val="clear" w:color="auto" w:fill="E1DFDD"/>
     </w:rPr>
   </w:style>
+  <w:style w:type="paragraph" w:styleId="SemEspaamento">
+    <w:name w:val="No Spacing"/>
+    <w:uiPriority w:val="1"/>
+    <w:qFormat/>
+    <w:rsid w:val="004F24BD"/>
+    <w:pPr>
+      <w:spacing w:after="0" w:line="240" w:lineRule="auto"/>
+    </w:pPr>
+  </w:style>
 </w:styles>
 </file>
 
@@ -14260,7 +15001,7 @@
 </file>
 
 <file path=customXml/itemProps4.xml><?xml version="1.0" encoding="utf-8"?>
-<ds:datastoreItem xmlns:ds="http://schemas.openxmlformats.org/officeDocument/2006/customXml" ds:itemID="{DEACE3F8-CEED-4822-90F3-9345A394D5E1}">
+<ds:datastoreItem xmlns:ds="http://schemas.openxmlformats.org/officeDocument/2006/customXml" ds:itemID="{A3BDAD02-876F-4356-99A5-1DC060EF0EF3}">
   <ds:schemaRefs>
     <ds:schemaRef ds:uri="http://schemas.openxmlformats.org/officeDocument/2006/bibliography"/>
   </ds:schemaRefs>

</xml_diff>